<commit_message>
fix: close phase 00 round 3 review findings
</commit_message>
<xml_diff>
--- a/tests/fixtures/locations.docx
+++ b/tests/fixtures/locations.docx
@@ -9,12 +9,14 @@
     </w:p>
     <w:p>
       <w:r>
-        <w:t>Exact DOCX target</w:t>
+        <w:t>Exact DOCX &amp;</w:t>
+        <w:t xml:space="preserve"> target</w:t>
       </w:r>
     </w:p>
     <w:p>
       <w:r>
-        <w:t>Exact DOCX target</w:t>
+        <w:t>Exact DOCX &amp;</w:t>
+        <w:t xml:space="preserve"> target</w:t>
       </w:r>
     </w:p>
   </w:body>

</xml_diff>